<commit_message>
4.2.1-rasm: IV chorak yil belgisi ostida, yozuvlar oq fonda
Co-Authored-By: Claude Opus 5.5 <noreply@anthropic.com>
Claude-Session: https://claude.ai/code/session_01PxHTC8Q7yHdrpAeUA5KUgM
</commit_message>
<xml_diff>
--- a/paragraflar/4.2-paragraf.docx
+++ b/paragraflar/4.2-paragraf.docx
@@ -2458,7 +2458,7 @@
         </w:rPr>
         <w:drawing>
           <wp:inline distT="0" distB="0" distL="0" distR="0">
-            <wp:extent cx="5760000" cy="2880000"/>
+            <wp:extent cx="5760000" cy="3240000"/>
             <wp:effectExtent l="0" t="0" r="0" b="0"/>
             <wp:docPr id="1001" name="4.2.1-rasm"/>
             <wp:cNvGraphicFramePr/>
@@ -7444,7 +7444,7 @@
               <c:strCache>
                 <c:ptCount val="1"/>
                 <c:pt idx="0">
-                  <c:v>Haqiqiy</c:v>
+                  <c:v>Haqiqiy (2021–2025)</c:v>
                 </c:pt>
               </c:strCache>
             </c:strRef>
@@ -7478,7 +7478,7 @@
               <c:delete val="1"/>
             </c:dLbl>
             <c:dLbl>
-              <c:idx val="2"/>
+              <c:idx val="3"/>
               <c:delete val="1"/>
             </c:dLbl>
             <c:dLbl>
@@ -7614,64 +7614,64 @@
                 <c:formatCode>General</c:formatCode>
                 <c:ptCount val="32"/>
                 <c:pt idx="0">
-                  <c:v>2020.625</c:v>
+                  <c:v>2020.25</c:v>
                 </c:pt>
                 <c:pt idx="1">
-                  <c:v>2020.875</c:v>
+                  <c:v>2020.5</c:v>
                 </c:pt>
                 <c:pt idx="2">
-                  <c:v>2021.125</c:v>
+                  <c:v>2020.75</c:v>
                 </c:pt>
                 <c:pt idx="3">
-                  <c:v>2021.375</c:v>
+                  <c:v>2021.0</c:v>
                 </c:pt>
                 <c:pt idx="4">
-                  <c:v>2021.625</c:v>
+                  <c:v>2021.25</c:v>
                 </c:pt>
                 <c:pt idx="5">
-                  <c:v>2021.875</c:v>
+                  <c:v>2021.5</c:v>
                 </c:pt>
                 <c:pt idx="6">
-                  <c:v>2022.125</c:v>
+                  <c:v>2021.75</c:v>
                 </c:pt>
                 <c:pt idx="7">
-                  <c:v>2022.375</c:v>
+                  <c:v>2022.0</c:v>
                 </c:pt>
                 <c:pt idx="8">
-                  <c:v>2022.625</c:v>
+                  <c:v>2022.25</c:v>
                 </c:pt>
                 <c:pt idx="9">
-                  <c:v>2022.875</c:v>
+                  <c:v>2022.5</c:v>
                 </c:pt>
                 <c:pt idx="10">
-                  <c:v>2023.125</c:v>
+                  <c:v>2022.75</c:v>
                 </c:pt>
                 <c:pt idx="11">
-                  <c:v>2023.375</c:v>
+                  <c:v>2023.0</c:v>
                 </c:pt>
                 <c:pt idx="12">
-                  <c:v>2023.625</c:v>
+                  <c:v>2023.25</c:v>
                 </c:pt>
                 <c:pt idx="13">
-                  <c:v>2023.875</c:v>
+                  <c:v>2023.5</c:v>
                 </c:pt>
                 <c:pt idx="14">
-                  <c:v>2024.125</c:v>
+                  <c:v>2023.75</c:v>
                 </c:pt>
                 <c:pt idx="15">
-                  <c:v>2024.375</c:v>
+                  <c:v>2024.0</c:v>
                 </c:pt>
                 <c:pt idx="16">
-                  <c:v>2024.625</c:v>
+                  <c:v>2024.25</c:v>
                 </c:pt>
                 <c:pt idx="17">
-                  <c:v>2024.875</c:v>
+                  <c:v>2024.5</c:v>
                 </c:pt>
                 <c:pt idx="18">
-                  <c:v>2025.125</c:v>
+                  <c:v>2024.75</c:v>
                 </c:pt>
                 <c:pt idx="19">
-                  <c:v>2025.375</c:v>
+                  <c:v>2025.0</c:v>
                 </c:pt>
               </c:numCache>
             </c:numRef>
@@ -7815,6 +7815,10 @@
             </c:dLbl>
             <c:dLbl>
               <c:idx val="11"/>
+              <c:delete val="1"/>
+            </c:dLbl>
+            <c:dLbl>
+              <c:idx val="12"/>
               <c:delete val="1"/>
             </c:dLbl>
             <c:dLbl>
@@ -7915,7 +7919,7 @@
                 <a:endParaRPr lang="uz-Latn-UZ"/>
               </a:p>
             </c:txPr>
-            <c:dLblPos val="r"/>
+            <c:dLblPos val="t"/>
             <c:showLegendKey val="0"/>
             <c:showVal val="1"/>
             <c:showCatName val="0"/>
@@ -7930,43 +7934,43 @@
                 <c:formatCode>General</c:formatCode>
                 <c:ptCount val="32"/>
                 <c:pt idx="0">
-                  <c:v>2025.375</c:v>
+                  <c:v>2025.0</c:v>
                 </c:pt>
                 <c:pt idx="1">
-                  <c:v>2025.625</c:v>
+                  <c:v>2025.25</c:v>
                 </c:pt>
                 <c:pt idx="2">
-                  <c:v>2025.875</c:v>
+                  <c:v>2025.5</c:v>
                 </c:pt>
                 <c:pt idx="3">
-                  <c:v>2026.125</c:v>
+                  <c:v>2025.75</c:v>
                 </c:pt>
                 <c:pt idx="4">
-                  <c:v>2026.375</c:v>
+                  <c:v>2026.0</c:v>
                 </c:pt>
                 <c:pt idx="5">
-                  <c:v>2026.625</c:v>
+                  <c:v>2026.25</c:v>
                 </c:pt>
                 <c:pt idx="6">
-                  <c:v>2026.875</c:v>
+                  <c:v>2026.5</c:v>
                 </c:pt>
                 <c:pt idx="7">
-                  <c:v>2027.125</c:v>
+                  <c:v>2026.75</c:v>
                 </c:pt>
                 <c:pt idx="8">
-                  <c:v>2027.375</c:v>
+                  <c:v>2027.0</c:v>
                 </c:pt>
                 <c:pt idx="9">
-                  <c:v>2027.625</c:v>
+                  <c:v>2027.25</c:v>
                 </c:pt>
                 <c:pt idx="10">
-                  <c:v>2027.875</c:v>
+                  <c:v>2027.5</c:v>
                 </c:pt>
                 <c:pt idx="11">
-                  <c:v>2028.125</c:v>
+                  <c:v>2027.75</c:v>
                 </c:pt>
                 <c:pt idx="12">
-                  <c:v>2028.375</c:v>
+                  <c:v>2028.0</c:v>
                 </c:pt>
               </c:numCache>
             </c:numRef>
@@ -8089,6 +8093,10 @@
             </c:dLbl>
             <c:dLbl>
               <c:idx val="11"/>
+              <c:delete val="1"/>
+            </c:dLbl>
+            <c:dLbl>
+              <c:idx val="12"/>
               <c:delete val="1"/>
             </c:dLbl>
             <c:dLbl>
@@ -8189,7 +8197,7 @@
                 <a:endParaRPr lang="uz-Latn-UZ"/>
               </a:p>
             </c:txPr>
-            <c:dLblPos val="r"/>
+            <c:dLblPos val="b"/>
             <c:showLegendKey val="0"/>
             <c:showVal val="1"/>
             <c:showCatName val="0"/>
@@ -8204,43 +8212,43 @@
                 <c:formatCode>General</c:formatCode>
                 <c:ptCount val="32"/>
                 <c:pt idx="0">
-                  <c:v>2025.375</c:v>
+                  <c:v>2025.0</c:v>
                 </c:pt>
                 <c:pt idx="1">
-                  <c:v>2025.625</c:v>
+                  <c:v>2025.25</c:v>
                 </c:pt>
                 <c:pt idx="2">
-                  <c:v>2025.875</c:v>
+                  <c:v>2025.5</c:v>
                 </c:pt>
                 <c:pt idx="3">
-                  <c:v>2026.125</c:v>
+                  <c:v>2025.75</c:v>
                 </c:pt>
                 <c:pt idx="4">
-                  <c:v>2026.375</c:v>
+                  <c:v>2026.0</c:v>
                 </c:pt>
                 <c:pt idx="5">
-                  <c:v>2026.625</c:v>
+                  <c:v>2026.25</c:v>
                 </c:pt>
                 <c:pt idx="6">
-                  <c:v>2026.875</c:v>
+                  <c:v>2026.5</c:v>
                 </c:pt>
                 <c:pt idx="7">
-                  <c:v>2027.125</c:v>
+                  <c:v>2026.75</c:v>
                 </c:pt>
                 <c:pt idx="8">
-                  <c:v>2027.375</c:v>
+                  <c:v>2027.0</c:v>
                 </c:pt>
                 <c:pt idx="9">
-                  <c:v>2027.625</c:v>
+                  <c:v>2027.25</c:v>
                 </c:pt>
                 <c:pt idx="10">
-                  <c:v>2027.875</c:v>
+                  <c:v>2027.5</c:v>
                 </c:pt>
                 <c:pt idx="11">
-                  <c:v>2028.125</c:v>
+                  <c:v>2027.75</c:v>
                 </c:pt>
                 <c:pt idx="12">
-                  <c:v>2028.375</c:v>
+                  <c:v>2028.0</c:v>
                 </c:pt>
               </c:numCache>
             </c:numRef>
@@ -8363,6 +8371,10 @@
             </c:dLbl>
             <c:dLbl>
               <c:idx val="11"/>
+              <c:delete val="1"/>
+            </c:dLbl>
+            <c:dLbl>
+              <c:idx val="12"/>
               <c:delete val="1"/>
             </c:dLbl>
             <c:dLbl>
@@ -8463,7 +8475,7 @@
                 <a:endParaRPr lang="uz-Latn-UZ"/>
               </a:p>
             </c:txPr>
-            <c:dLblPos val="r"/>
+            <c:dLblPos val="t"/>
             <c:showLegendKey val="0"/>
             <c:showVal val="1"/>
             <c:showCatName val="0"/>
@@ -8478,43 +8490,43 @@
                 <c:formatCode>General</c:formatCode>
                 <c:ptCount val="32"/>
                 <c:pt idx="0">
-                  <c:v>2025.375</c:v>
+                  <c:v>2025.0</c:v>
                 </c:pt>
                 <c:pt idx="1">
-                  <c:v>2025.625</c:v>
+                  <c:v>2025.25</c:v>
                 </c:pt>
                 <c:pt idx="2">
-                  <c:v>2025.875</c:v>
+                  <c:v>2025.5</c:v>
                 </c:pt>
                 <c:pt idx="3">
-                  <c:v>2026.125</c:v>
+                  <c:v>2025.75</c:v>
                 </c:pt>
                 <c:pt idx="4">
-                  <c:v>2026.375</c:v>
+                  <c:v>2026.0</c:v>
                 </c:pt>
                 <c:pt idx="5">
-                  <c:v>2026.625</c:v>
+                  <c:v>2026.25</c:v>
                 </c:pt>
                 <c:pt idx="6">
-                  <c:v>2026.875</c:v>
+                  <c:v>2026.5</c:v>
                 </c:pt>
                 <c:pt idx="7">
-                  <c:v>2027.125</c:v>
+                  <c:v>2026.75</c:v>
                 </c:pt>
                 <c:pt idx="8">
-                  <c:v>2027.375</c:v>
+                  <c:v>2027.0</c:v>
                 </c:pt>
                 <c:pt idx="9">
-                  <c:v>2027.625</c:v>
+                  <c:v>2027.25</c:v>
                 </c:pt>
                 <c:pt idx="10">
-                  <c:v>2027.875</c:v>
+                  <c:v>2027.5</c:v>
                 </c:pt>
                 <c:pt idx="11">
-                  <c:v>2028.125</c:v>
+                  <c:v>2027.75</c:v>
                 </c:pt>
                 <c:pt idx="12">
-                  <c:v>2028.375</c:v>
+                  <c:v>2028.0</c:v>
                 </c:pt>
               </c:numCache>
             </c:numRef>
@@ -8637,6 +8649,10 @@
             </c:dLbl>
             <c:dLbl>
               <c:idx val="11"/>
+              <c:delete val="1"/>
+            </c:dLbl>
+            <c:dLbl>
+              <c:idx val="12"/>
               <c:delete val="1"/>
             </c:dLbl>
             <c:dLbl>
@@ -8737,7 +8753,7 @@
                 <a:endParaRPr lang="uz-Latn-UZ"/>
               </a:p>
             </c:txPr>
-            <c:dLblPos val="r"/>
+            <c:dLblPos val="t"/>
             <c:showLegendKey val="0"/>
             <c:showVal val="1"/>
             <c:showCatName val="0"/>
@@ -8752,43 +8768,43 @@
                 <c:formatCode>General</c:formatCode>
                 <c:ptCount val="32"/>
                 <c:pt idx="0">
-                  <c:v>2025.375</c:v>
+                  <c:v>2025.0</c:v>
                 </c:pt>
                 <c:pt idx="1">
-                  <c:v>2025.625</c:v>
+                  <c:v>2025.25</c:v>
                 </c:pt>
                 <c:pt idx="2">
-                  <c:v>2025.875</c:v>
+                  <c:v>2025.5</c:v>
                 </c:pt>
                 <c:pt idx="3">
-                  <c:v>2026.125</c:v>
+                  <c:v>2025.75</c:v>
                 </c:pt>
                 <c:pt idx="4">
-                  <c:v>2026.375</c:v>
+                  <c:v>2026.0</c:v>
                 </c:pt>
                 <c:pt idx="5">
-                  <c:v>2026.625</c:v>
+                  <c:v>2026.25</c:v>
                 </c:pt>
                 <c:pt idx="6">
-                  <c:v>2026.875</c:v>
+                  <c:v>2026.5</c:v>
                 </c:pt>
                 <c:pt idx="7">
-                  <c:v>2027.125</c:v>
+                  <c:v>2026.75</c:v>
                 </c:pt>
                 <c:pt idx="8">
-                  <c:v>2027.375</c:v>
+                  <c:v>2027.0</c:v>
                 </c:pt>
                 <c:pt idx="9">
-                  <c:v>2027.625</c:v>
+                  <c:v>2027.25</c:v>
                 </c:pt>
                 <c:pt idx="10">
-                  <c:v>2027.875</c:v>
+                  <c:v>2027.5</c:v>
                 </c:pt>
                 <c:pt idx="11">
-                  <c:v>2028.125</c:v>
+                  <c:v>2027.75</c:v>
                 </c:pt>
                 <c:pt idx="12">
-                  <c:v>2028.375</c:v>
+                  <c:v>2028.0</c:v>
                 </c:pt>
               </c:numCache>
             </c:numRef>
@@ -8850,8 +8866,8 @@
         <c:axId val="333"/>
         <c:scaling>
           <c:orientation val="minMax"/>
-          <c:max val="2028.5"/>
-          <c:min val="2020.5"/>
+          <c:max val="2028"/>
+          <c:min val="2020"/>
         </c:scaling>
         <c:delete val="0"/>
         <c:axPos val="b"/>
@@ -8877,14 +8893,14 @@
                     </a:solidFill>
                     <a:latin typeface="Times New Roman"/>
                   </a:rPr>
-                  <a:t>Yillar (choraklar)</a:t>
+                  <a:t>Yillar</a:t>
                 </a:r>
               </a:p>
             </c:rich>
           </c:tx>
           <c:overlay val="0"/>
         </c:title>
-        <c:numFmt formatCode="0" sourceLinked="0"/>
+        <c:numFmt formatCode="[&lt;2020.5]&quot;&quot;;0" sourceLinked="0"/>
         <c:majorTickMark val="out"/>
         <c:minorTickMark val="none"/>
         <c:tickLblPos val="low"/>

</xml_diff>